<commit_message>
feat: add API documentation, frontend application, and styling for library management system
- Created API documentation for authentication, books, and loans.
- Implemented frontend application logic in app.js for user authentication, book management, and loan tracking.
- Developed HTML structure for the library management interface in index.html.
- Added CSS styles for layout, components, and responsiveness in styles.css.
</commit_message>
<xml_diff>
--- a/docs/REQUISITOS_FUNCIONAIS.docx
+++ b/docs/REQUISITOS_FUNCIONAIS.docx
@@ -39,15 +39,15 @@
         <w:pStyle w:val="Normal"/>
       </w:pPr>
       <w:r>
-        <w:t xml:space="preserve">O sistema apoia atividades básicas de uma biblioteca: autenticação demonstrativa de bibliotecário, consulta e cadastro de livros e acompanhamento de empréstimos. O protótipo é executado no navegador e mantém os dados localmente. O banco PostgreSQL documentado no projeto representa o modelo previsto para uma versão com servidor.</w:t>
-      </w:r>
-    </w:p>
-    <w:p>
-      <w:pPr>
-        <w:pStyle w:val="Heading1"/>
-      </w:pPr>
-      <w:r>
-        <w:t xml:space="preserve">Ator</w:t>
+        <w:t xml:space="preserve">O sistema apoia atividades básicas de uma biblioteca: autenticação de bibliotecário, consulta e cadastro de livros e acompanhamento de empréstimos. A interface web usa uma API ASP.NET Core para autenticar usuários e persistir os dados no PostgreSQL.</w:t>
+      </w:r>
+    </w:p>
+    <w:p>
+      <w:pPr>
+        <w:pStyle w:val="Heading1"/>
+      </w:pPr>
+      <w:r>
+        <w:t xml:space="preserve">Atores</w:t>
       </w:r>
     </w:p>
     <w:p>
@@ -183,7 +183,7 @@
         <w:pStyle w:val="Normal"/>
       </w:pPr>
       <w:r>
-        <w:t xml:space="preserve">RF-15 | Média | O sistema deve preservar livros e empréstimos cadastrados entre recargas da página no mesmo navegador.</w:t>
+        <w:t xml:space="preserve">RF-15 | Alta | O sistema deve persistir livros e empréstimos no PostgreSQL, permitindo consultar os mesmos registros em sessões e navegadores autorizados.</w:t>
       </w:r>
     </w:p>
     <w:p>
@@ -247,7 +247,7 @@
         <w:pStyle w:val="Normal"/>
       </w:pPr>
       <w:r>
-        <w:t xml:space="preserve">7. A credencial fixa na interface é apenas demonstrativa; uma versão de produção deve autenticar no servidor.</w:t>
+        <w:t xml:space="preserve">7. A senha deve ser verificada no servidor; a credencial inicial fornecida pelo script é exclusiva para desenvolvimento e deve ser alterada antes da implantação.</w:t>
       </w:r>
     </w:p>
     <w:p>
@@ -295,7 +295,7 @@
         <w:pStyle w:val="Normal"/>
       </w:pPr>
       <w:r>
-        <w:t xml:space="preserve">• O protótipo não é adequado para uso em produção sem backend, controle de acesso e persistência segura.</w:t>
+        <w:t xml:space="preserve">• O sistema exige backend e banco de dados disponíveis; sessões e operações de dados devem ser protegidas no servidor.</w:t>
       </w:r>
     </w:p>
     <w:sectPr>

</xml_diff>